<commit_message>
Refactor HR document templates and database for improved clarity and usability. Updated various forms including Duty Resumption, Employee Contract Renewal, Grievance, and Leave Application to enhance formatting and dynamic content integration. Modified injaaz.db to reflect these updates.
</commit_message>
<xml_diff>
--- a/HR Documents/Duty Resumption Form - INJAAZ.DOCX
+++ b/HR Documents/Duty Resumption Form - INJAAZ.DOCX
@@ -126,20 +126,8 @@
             <w:shd w:val="clear" w:color="auto" w:fill="F1F1F1"/>
           </w:tcPr>
           <w:p>
-            <w:pPr>
-              <w:pStyle w:val="TableParagraph"/>
-              <w:spacing w:before="56"/>
-              <w:rPr>
-                <w:b/>
-                <w:sz w:val="28"/>
-              </w:rPr>
-            </w:pPr>
-            <w:r>
-              <w:rPr>
-                <w:b/>
-                <w:sz w:val="28"/>
-              </w:rPr>
-              <w:t>Requester:</w:t>
+            <w:r>
+              <w:t>{{ requester }}</w:t>
             </w:r>
           </w:p>
         </w:tc>
@@ -157,31 +145,8 @@
             </w:tcBorders>
           </w:tcPr>
           <w:p>
-            <w:pPr>
-              <w:pStyle w:val="TableParagraph"/>
-              <w:spacing w:before="83"/>
-              <w:rPr>
-                <w:sz w:val="24"/>
-              </w:rPr>
-            </w:pPr>
-            <w:r>
-              <w:rPr>
-                <w:sz w:val="24"/>
-              </w:rPr>
-              <w:t>Employee</w:t>
-            </w:r>
-            <w:r>
-              <w:rPr>
-                <w:spacing w:val="-3"/>
-                <w:sz w:val="24"/>
-              </w:rPr>
-              <w:t xml:space="preserve"> </w:t>
-            </w:r>
-            <w:r>
-              <w:rPr>
-                <w:sz w:val="24"/>
-              </w:rPr>
-              <w:t>Name:</w:t>
+            <w:r>
+              <w:t>{{ employee_name }}</w:t>
             </w:r>
           </w:p>
         </w:tc>
@@ -238,30 +203,8 @@
             </w:tcBorders>
           </w:tcPr>
           <w:p>
-            <w:pPr>
-              <w:pStyle w:val="TableParagraph"/>
-              <w:spacing w:before="9"/>
-              <w:ind w:left="0"/>
-              <w:rPr>
-                <w:rFonts w:ascii="Arial"/>
-                <w:b/>
-                <w:sz w:val="20"/>
-              </w:rPr>
-            </w:pPr>
-          </w:p>
-          <w:p>
-            <w:pPr>
-              <w:pStyle w:val="TableParagraph"/>
-              <w:ind w:left="107"/>
-              <w:rPr>
-                <w:sz w:val="24"/>
-              </w:rPr>
-            </w:pPr>
-            <w:r>
-              <w:rPr>
-                <w:sz w:val="24"/>
-              </w:rPr>
-              <w:t>Company:</w:t>
+            <w:r>
+              <w:t>{{ job_title }}</w:t>
             </w:r>
           </w:p>
         </w:tc>
@@ -416,19 +359,8 @@
             </w:tcBorders>
           </w:tcPr>
           <w:p>
-            <w:pPr>
-              <w:pStyle w:val="TableParagraph"/>
-              <w:spacing w:before="83"/>
-              <w:ind w:left="0"/>
-              <w:rPr>
-                <w:sz w:val="24"/>
-              </w:rPr>
-            </w:pPr>
-            <w:r>
-              <w:rPr>
-                <w:sz w:val="24"/>
-              </w:rPr>
-              <w:t xml:space="preserve"> Leave Ended:</w:t>
+            <w:r>
+              <w:t>{{ leave_started }}</w:t>
             </w:r>
           </w:p>
         </w:tc>
@@ -447,24 +379,8 @@
             </w:tcBorders>
           </w:tcPr>
           <w:p>
-            <w:pPr>
-              <w:pStyle w:val="TableParagraph"/>
-              <w:ind w:left="0"/>
-              <w:rPr>
-                <w:sz w:val="24"/>
-              </w:rPr>
-            </w:pPr>
-            <w:r>
-              <w:rPr>
-                <w:sz w:val="24"/>
-              </w:rPr>
-              <w:t xml:space="preserve">  </w:t>
-            </w:r>
-            <w:r>
-              <w:rPr>
-                <w:sz w:val="24"/>
-              </w:rPr>
-              <w:t>Planned Resumption Date:</w:t>
+            <w:r>
+              <w:t>{{ planned_resumption_date }}</w:t>
             </w:r>
           </w:p>
         </w:tc>
@@ -483,16 +399,8 @@
             </w:tcBorders>
           </w:tcPr>
           <w:p>
-            <w:pPr>
-              <w:pStyle w:val="TableParagraph"/>
-              <w:ind w:left="107"/>
-              <w:rPr>
-                <w:sz w:val="2"/>
-                <w:szCs w:val="2"/>
-              </w:rPr>
-            </w:pPr>
-            <w:r>
-              <w:t>Actual Resumption Date:</w:t>
+            <w:r>
+              <w:t>{{ actual_resumption_date }}</w:t>
             </w:r>
           </w:p>
         </w:tc>
@@ -510,55 +418,8 @@
             </w:tcBorders>
           </w:tcPr>
           <w:p>
-            <w:pPr>
-              <w:pStyle w:val="TableParagraph"/>
-              <w:ind w:left="107"/>
-              <w:rPr>
-                <w:sz w:val="2"/>
-                <w:szCs w:val="2"/>
-              </w:rPr>
-            </w:pPr>
-          </w:p>
-          <w:p>
-            <w:pPr>
-              <w:rPr>
-                <w:b/>
-                <w:bCs/>
-              </w:rPr>
-            </w:pPr>
-            <w:r>
-              <w:t xml:space="preserve"> </w:t>
-            </w:r>
-            <w:r>
-              <w:rPr>
-                <w:b/>
-                <w:bCs/>
-              </w:rPr>
-              <w:t>Note:</w:t>
-            </w:r>
-          </w:p>
-          <w:p>
-            <w:pPr>
-              <w:spacing w:line="360" w:lineRule="auto"/>
-            </w:pPr>
-            <w:r>
-              <w:t xml:space="preserve">           ___________________________________________________________________________________________</w:t>
-            </w:r>
-          </w:p>
-          <w:p>
-            <w:pPr>
-              <w:spacing w:line="360" w:lineRule="auto"/>
-            </w:pPr>
-            <w:r>
-              <w:t xml:space="preserve">           ___________________________________________________________________________________________</w:t>
-            </w:r>
-          </w:p>
-          <w:p>
-            <w:pPr>
-              <w:spacing w:line="360" w:lineRule="auto"/>
-            </w:pPr>
-            <w:r>
-              <w:t xml:space="preserve">           ___________________________________________________________________________________________</w:t>
+            <w:r>
+              <w:t>{{ note }}</w:t>
             </w:r>
           </w:p>
         </w:tc>

</xml_diff>

<commit_message>
Refactor configuration and enhance report generation API with user authentication. Updated SQLAlchemy settings for SQLite compatibility and improved access control in report regeneration routes. Enhanced HR document templates for better clarity and usability, including various forms and templates for employee management.
</commit_message>
<xml_diff>
--- a/HR Documents/Duty Resumption Form - INJAAZ.DOCX
+++ b/HR Documents/Duty Resumption Form - INJAAZ.DOCX
@@ -127,7 +127,7 @@
           </w:tcPr>
           <w:p>
             <w:r>
-              <w:t>{{ requester }}</w:t>
+              <w:t>Requester {{ requester }}</w:t>
             </w:r>
           </w:p>
         </w:tc>
@@ -146,7 +146,7 @@
           </w:tcPr>
           <w:p>
             <w:r>
-              <w:t>{{ employee_name }}</w:t>
+              <w:t>Employee Name {{ employee_name }}</w:t>
             </w:r>
           </w:p>
         </w:tc>
@@ -204,7 +204,7 @@
           </w:tcPr>
           <w:p>
             <w:r>
-              <w:t>{{ job_title }}</w:t>
+              <w:t>Job Title {{ job_title }}</w:t>
             </w:r>
           </w:p>
         </w:tc>
@@ -360,7 +360,7 @@
           </w:tcPr>
           <w:p>
             <w:r>
-              <w:t>{{ leave_started }}</w:t>
+              <w:t>Leave Started {{ leave_started }}</w:t>
             </w:r>
           </w:p>
         </w:tc>
@@ -380,7 +380,7 @@
           </w:tcPr>
           <w:p>
             <w:r>
-              <w:t>{{ planned_resumption_date }}</w:t>
+              <w:t>Planned Resumption {{ planned_resumption_date }}</w:t>
             </w:r>
           </w:p>
         </w:tc>
@@ -400,7 +400,7 @@
           </w:tcPr>
           <w:p>
             <w:r>
-              <w:t>{{ actual_resumption_date }}</w:t>
+              <w:t>Actual Resumption {{ actual_resumption_date }}</w:t>
             </w:r>
           </w:p>
         </w:tc>
@@ -419,7 +419,7 @@
           </w:tcPr>
           <w:p>
             <w:r>
-              <w:t>{{ note }}</w:t>
+              <w:t>Note {{ note }}</w:t>
             </w:r>
           </w:p>
         </w:tc>
@@ -458,25 +458,8 @@
             </w:tcBorders>
           </w:tcPr>
           <w:p>
-            <w:pPr>
-              <w:pStyle w:val="TableParagraph"/>
-              <w:ind w:left="0"/>
-              <w:rPr>
-                <w:sz w:val="2"/>
-                <w:szCs w:val="2"/>
-              </w:rPr>
-            </w:pPr>
-            <w:r>
-              <w:rPr>
-                <w:sz w:val="2"/>
-                <w:szCs w:val="2"/>
-              </w:rPr>
-              <w:t xml:space="preserve">   </w:t>
-            </w:r>
-          </w:p>
-          <w:p>
-            <w:r>
-              <w:t xml:space="preserve"> Date:</w:t>
+            <w:r>
+              <w:t>Employee Signature {{ employee_signature }}</w:t>
             </w:r>
           </w:p>
         </w:tc>
@@ -813,26 +796,8 @@
             <w:shd w:val="clear" w:color="auto" w:fill="auto"/>
           </w:tcPr>
           <w:p>
-            <w:pPr>
-              <w:pStyle w:val="TableParagraph"/>
-              <w:spacing w:before="99"/>
-              <w:ind w:left="0"/>
-              <w:rPr>
-                <w:b/>
-              </w:rPr>
-            </w:pPr>
-            <w:r>
-              <w:rPr>
-                <w:b/>
-                <w:sz w:val="24"/>
-              </w:rPr>
-              <w:t xml:space="preserve"> </w:t>
-            </w:r>
-            <w:r>
-              <w:rPr>
-                <w:bCs/>
-              </w:rPr>
-              <w:t>Date:</w:t>
+            <w:r>
+              <w:t>HR Signature {{ hr_signature }}</w:t>
             </w:r>
           </w:p>
         </w:tc>

</xml_diff>